<commit_message>
Use original Word SOPs in library; docx-preview rendering; numbering + cache fixes
</commit_message>
<xml_diff>
--- a/sops/SOP-001 GxP Document Control.docx
+++ b/sops/SOP-001 GxP Document Control.docx
@@ -61,19 +61,7 @@
         <w:rPr>
           <w:rFonts w:cs="Calibri"/>
         </w:rPr>
-        <w:t xml:space="preserve">This SOP applies to </w:t>
-      </w:r>
-      <w:r>
-        <w:rPr>
-          <w:rFonts w:cs="Calibri"/>
-        </w:rPr>
-        <w:t>only the part-time employees</w:t>
-      </w:r>
-      <w:r>
-        <w:rPr>
-          <w:rFonts w:cs="Calibri"/>
-        </w:rPr>
-        <w:t xml:space="preserve"> involved in the creation of new and revised controlled documents generated at </w:t>
+        <w:t xml:space="preserve">This SOP applies to all employees and contractors involved in the creation of new and revised controlled documents generated at </w:t>
       </w:r>
       <w:proofErr w:type="spellStart"/>
       <w:r>
@@ -11809,21 +11797,6 @@
 </file>
 
 <file path=customXml/item1.xml><?xml version="1.0" encoding="utf-8"?>
-<?mso-contentType ?>
-<FormTemplates xmlns="http://schemas.microsoft.com/sharepoint/v3/contenttype/forms">
-  <Display>DocumentLibraryForm</Display>
-  <Edit>DocumentLibraryForm</Edit>
-  <New>DocumentLibraryForm</New>
-</FormTemplates>
-</file>
-
-<file path=customXml/item2.xml><?xml version="1.0" encoding="utf-8"?>
-<p:properties xmlns:p="http://schemas.microsoft.com/office/2006/metadata/properties" xmlns:xsi="http://www.w3.org/2001/XMLSchema-instance" xmlns:pc="http://schemas.microsoft.com/office/infopath/2007/PartnerControls">
-  <documentManagement/>
-</p:properties>
-</file>
-
-<file path=customXml/item3.xml><?xml version="1.0" encoding="utf-8"?>
 <ct:contentTypeSchema xmlns:ct="http://schemas.microsoft.com/office/2006/metadata/contentType" xmlns:ma="http://schemas.microsoft.com/office/2006/metadata/properties/metaAttributes" ct:_="" ma:_="" ma:contentTypeName="Document" ma:contentTypeID="0x010100CDBAE9938B18BF4C90CF515153FE8AC3" ma:contentTypeVersion="4" ma:contentTypeDescription="Create a new document." ma:contentTypeScope="" ma:versionID="48573116b17da7140b8831e8f76a6343">
   <xsd:schema xmlns:xsd="http://www.w3.org/2001/XMLSchema" xmlns:xs="http://www.w3.org/2001/XMLSchema" xmlns:p="http://schemas.microsoft.com/office/2006/metadata/properties" xmlns:ns2="239f683c-c52a-4261-8cd7-34248fd8e944" targetNamespace="http://schemas.microsoft.com/office/2006/metadata/properties" ma:root="true" ma:fieldsID="51e6ea27b6805f17078437d22ee9c982" ns2:_="">
     <xsd:import namespace="239f683c-c52a-4261-8cd7-34248fd8e944"/>
@@ -11967,24 +11940,22 @@
 </ct:contentTypeSchema>
 </file>
 
-<file path=customXml/itemProps1.xml><?xml version="1.0" encoding="utf-8"?>
-<ds:datastoreItem xmlns:ds="http://schemas.openxmlformats.org/officeDocument/2006/customXml" ds:itemID="{96E3243C-06F0-4C4C-8FEA-83D4CFA2D1DF}">
-  <ds:schemaRefs>
-    <ds:schemaRef ds:uri="http://schemas.microsoft.com/sharepoint/v3/contenttype/forms"/>
-  </ds:schemaRefs>
-</ds:datastoreItem>
+<file path=customXml/item2.xml><?xml version="1.0" encoding="utf-8"?>
+<p:properties xmlns:p="http://schemas.microsoft.com/office/2006/metadata/properties" xmlns:xsi="http://www.w3.org/2001/XMLSchema-instance" xmlns:pc="http://schemas.microsoft.com/office/infopath/2007/PartnerControls">
+  <documentManagement/>
+</p:properties>
 </file>
 
-<file path=customXml/itemProps2.xml><?xml version="1.0" encoding="utf-8"?>
-<ds:datastoreItem xmlns:ds="http://schemas.openxmlformats.org/officeDocument/2006/customXml" ds:itemID="{624013D2-CD92-479E-8376-118447899343}">
-  <ds:schemaRefs>
-    <ds:schemaRef ds:uri="http://schemas.microsoft.com/office/2006/metadata/properties"/>
-    <ds:schemaRef ds:uri="http://schemas.microsoft.com/office/infopath/2007/PartnerControls"/>
-  </ds:schemaRefs>
-</ds:datastoreItem>
+<file path=customXml/item3.xml><?xml version="1.0" encoding="utf-8"?>
+<?mso-contentType ?>
+<FormTemplates xmlns="http://schemas.microsoft.com/sharepoint/v3/contenttype/forms">
+  <Display>DocumentLibraryForm</Display>
+  <Edit>DocumentLibraryForm</Edit>
+  <New>DocumentLibraryForm</New>
+</FormTemplates>
 </file>
 
-<file path=customXml/itemProps3.xml><?xml version="1.0" encoding="utf-8"?>
+<file path=customXml/itemProps1.xml><?xml version="1.0" encoding="utf-8"?>
 <ds:datastoreItem xmlns:ds="http://schemas.openxmlformats.org/officeDocument/2006/customXml" ds:itemID="{F8FDE2E7-D1F7-4F5E-9D42-C1613B3508BC}">
   <ds:schemaRefs>
     <ds:schemaRef ds:uri="http://schemas.microsoft.com/office/2006/metadata/contentType"/>
@@ -12000,4 +11971,21 @@
     <ds:schemaRef ds:uri="http://schemas.microsoft.com/internal/obd"/>
   </ds:schemaRefs>
 </ds:datastoreItem>
+</file>
+
+<file path=customXml/itemProps2.xml><?xml version="1.0" encoding="utf-8"?>
+<ds:datastoreItem xmlns:ds="http://schemas.openxmlformats.org/officeDocument/2006/customXml" ds:itemID="{624013D2-CD92-479E-8376-118447899343}">
+  <ds:schemaRefs>
+    <ds:schemaRef ds:uri="http://schemas.microsoft.com/office/2006/metadata/properties"/>
+    <ds:schemaRef ds:uri="http://schemas.microsoft.com/office/infopath/2007/PartnerControls"/>
+  </ds:schemaRefs>
+</ds:datastoreItem>
+</file>
+
+<file path=customXml/itemProps3.xml><?xml version="1.0" encoding="utf-8"?>
+<ds:datastoreItem xmlns:ds="http://schemas.openxmlformats.org/officeDocument/2006/customXml" ds:itemID="{96E3243C-06F0-4C4C-8FEA-83D4CFA2D1DF}">
+  <ds:schemaRefs>
+    <ds:schemaRef ds:uri="http://schemas.microsoft.com/sharepoint/v3/contenttype/forms"/>
+  </ds:schemaRefs>
+</ds:datastoreItem>
 </file>
</xml_diff>